<commit_message>
Guia: manchetes EXTRA entre as partes e Parte 5 com frases de efeito para print
Co-Authored-By: Claude Opus 5.5 <noreply@anthropic.com>
Claude-Session: https://claude.ai/code/session_01GJhkYfDrHd3AkmDKDTo71F
</commit_message>
<xml_diff>
--- a/curso/dist/Guia-Como-Convencer-um-Petista.docx
+++ b/curso/dist/Guia-Como-Convencer-um-Petista.docx
@@ -470,7 +470,7 @@
         <w:t xml:space="preserve">Parte 2 · Xeque-mate em 5 jogadas</w:t>
       </w:r>
       <w:r>
-        <w:t xml:space="preserve">11</w:t>
+        <w:t xml:space="preserve">12</w:t>
       </w:r>
     </w:p>
     <w:p>
@@ -485,7 +485,7 @@
         <w:t xml:space="preserve">2.1 As 5 jogadas em 1 página</w:t>
       </w:r>
       <w:r>
-        <w:t xml:space="preserve">12</w:t>
+        <w:t xml:space="preserve">13</w:t>
       </w:r>
     </w:p>
     <w:p>
@@ -500,7 +500,7 @@
         <w:t xml:space="preserve">2.2 A isca e a armadilha</w:t>
       </w:r>
       <w:r>
-        <w:t xml:space="preserve">13</w:t>
+        <w:t xml:space="preserve">14</w:t>
       </w:r>
     </w:p>
     <w:p>
@@ -515,7 +515,7 @@
         <w:t xml:space="preserve">2.3 O escudo · A sua história</w:t>
       </w:r>
       <w:r>
-        <w:t xml:space="preserve">15</w:t>
+        <w:t xml:space="preserve">16</w:t>
       </w:r>
     </w:p>
     <w:p>
@@ -530,7 +530,7 @@
         <w:t xml:space="preserve">2.4 O golpe e a saída por cima</w:t>
       </w:r>
       <w:r>
-        <w:t xml:space="preserve">16</w:t>
+        <w:t xml:space="preserve">17</w:t>
       </w:r>
     </w:p>
     <w:p>
@@ -545,7 +545,7 @@
         <w:t xml:space="preserve">Parte 3 · As 12 desculpas do petista</w:t>
       </w:r>
       <w:r>
-        <w:t xml:space="preserve">17</w:t>
+        <w:t xml:space="preserve">19</w:t>
       </w:r>
     </w:p>
     <w:p>
@@ -560,7 +560,7 @@
         <w:t xml:space="preserve">3.1 “O Lula cuida dos pobres”</w:t>
       </w:r>
       <w:r>
-        <w:t xml:space="preserve">18</w:t>
+        <w:t xml:space="preserve">20</w:t>
       </w:r>
     </w:p>
     <w:p>
@@ -575,7 +575,7 @@
         <w:t xml:space="preserve">3.2 “Mas o desemprego caiu”</w:t>
       </w:r>
       <w:r>
-        <w:t xml:space="preserve">19</w:t>
+        <w:t xml:space="preserve">21</w:t>
       </w:r>
     </w:p>
     <w:p>
@@ -590,7 +590,7 @@
         <w:t xml:space="preserve">3.3 “Imposto é só para os ricos”</w:t>
       </w:r>
       <w:r>
-        <w:t xml:space="preserve">20</w:t>
+        <w:t xml:space="preserve">22</w:t>
       </w:r>
     </w:p>
     <w:p>
@@ -605,7 +605,7 @@
         <w:t xml:space="preserve">3.4 “A dívida é herança do Bolsonaro”</w:t>
       </w:r>
       <w:r>
-        <w:t xml:space="preserve">21</w:t>
+        <w:t xml:space="preserve">23</w:t>
       </w:r>
     </w:p>
     <w:p>
@@ -620,7 +620,7 @@
         <w:t xml:space="preserve">3.5 “O Brasil está crescendo”</w:t>
       </w:r>
       <w:r>
-        <w:t xml:space="preserve">22</w:t>
+        <w:t xml:space="preserve">24</w:t>
       </w:r>
     </w:p>
     <w:p>
@@ -635,7 +635,7 @@
         <w:t xml:space="preserve">3.6 “O Lula foi inocentado”</w:t>
       </w:r>
       <w:r>
-        <w:t xml:space="preserve">23</w:t>
+        <w:t xml:space="preserve">25</w:t>
       </w:r>
     </w:p>
     <w:p>
@@ -650,7 +650,7 @@
         <w:t xml:space="preserve">3.7 “A Venezuela é culpa dos EUA”</w:t>
       </w:r>
       <w:r>
-        <w:t xml:space="preserve">24</w:t>
+        <w:t xml:space="preserve">26</w:t>
       </w:r>
     </w:p>
     <w:p>
@@ -665,7 +665,7 @@
         <w:t xml:space="preserve">3.8 “O Milei quebrou a Argentina”</w:t>
       </w:r>
       <w:r>
-        <w:t xml:space="preserve">25</w:t>
+        <w:t xml:space="preserve">27</w:t>
       </w:r>
     </w:p>
     <w:p>
@@ -680,7 +680,7 @@
         <w:t xml:space="preserve">3.9 “A Bolívia estava bem com o MAS”</w:t>
       </w:r>
       <w:r>
-        <w:t xml:space="preserve">26</w:t>
+        <w:t xml:space="preserve">28</w:t>
       </w:r>
     </w:p>
     <w:p>
@@ -695,7 +695,7 @@
         <w:t xml:space="preserve">3.10 “Quem é contra o governo é golpista”</w:t>
       </w:r>
       <w:r>
-        <w:t xml:space="preserve">27</w:t>
+        <w:t xml:space="preserve">29</w:t>
       </w:r>
     </w:p>
     <w:bookmarkEnd w:id="21"/>
@@ -718,7 +718,7 @@
         <w:t xml:space="preserve">3.11 “Isso é site de direita”</w:t>
       </w:r>
       <w:r>
-        <w:t xml:space="preserve">28</w:t>
+        <w:t xml:space="preserve">30</w:t>
       </w:r>
     </w:p>
     <w:p>
@@ -733,7 +733,7 @@
         <w:t xml:space="preserve">3.12 “Se não gosta, vai embora”</w:t>
       </w:r>
       <w:r>
-        <w:t xml:space="preserve">29</w:t>
+        <w:t xml:space="preserve">31</w:t>
       </w:r>
     </w:p>
     <w:p>
@@ -748,7 +748,7 @@
         <w:t xml:space="preserve">Parte 4 · Munição pronta</w:t>
       </w:r>
       <w:r>
-        <w:t xml:space="preserve">30</w:t>
+        <w:t xml:space="preserve">33</w:t>
       </w:r>
     </w:p>
     <w:p>
@@ -763,7 +763,7 @@
         <w:t xml:space="preserve">4.1 6 mensagens para disparar</w:t>
       </w:r>
       <w:r>
-        <w:t xml:space="preserve">31</w:t>
+        <w:t xml:space="preserve">34</w:t>
       </w:r>
     </w:p>
     <w:p>
@@ -778,7 +778,7 @@
         <w:t xml:space="preserve">4.2 O ataque do almoço de domingo</w:t>
       </w:r>
       <w:r>
-        <w:t xml:space="preserve">32</w:t>
+        <w:t xml:space="preserve">35</w:t>
       </w:r>
     </w:p>
     <w:p>
@@ -793,7 +793,7 @@
         <w:t xml:space="preserve">4.3 O grupo da família</w:t>
       </w:r>
       <w:r>
-        <w:t xml:space="preserve">33</w:t>
+        <w:t xml:space="preserve">36</w:t>
       </w:r>
     </w:p>
     <w:p>
@@ -808,7 +808,7 @@
         <w:t xml:space="preserve">4.4 Quando o petista surta</w:t>
       </w:r>
       <w:r>
-        <w:t xml:space="preserve">34</w:t>
+        <w:t xml:space="preserve">37</w:t>
       </w:r>
     </w:p>
     <w:p>
@@ -823,7 +823,7 @@
         <w:t xml:space="preserve">4.5 Operação 30 dias</w:t>
       </w:r>
       <w:r>
-        <w:t xml:space="preserve">35</w:t>
+        <w:t xml:space="preserve">38</w:t>
       </w:r>
     </w:p>
     <w:p>
@@ -838,7 +838,7 @@
         <w:t xml:space="preserve">4.6 Ele não mudou? A conta vai chegar</w:t>
       </w:r>
       <w:r>
-        <w:t xml:space="preserve">36</w:t>
+        <w:t xml:space="preserve">39</w:t>
       </w:r>
     </w:p>
     <w:p>
@@ -850,10 +850,70 @@
         <w:pStyle w:val="Compact"/>
       </w:pPr>
       <w:r>
+        <w:t xml:space="preserve">Parte 5 · Frases de efeito para print</w:t>
+      </w:r>
+      <w:r>
+        <w:t xml:space="preserve">41</w:t>
+      </w:r>
+    </w:p>
+    <w:p>
+      <w:pPr>
+        <w:numPr>
+          <w:ilvl w:val="0"/>
+          <w:numId w:val="1002"/>
+        </w:numPr>
+        <w:pStyle w:val="Compact"/>
+      </w:pPr>
+      <w:r>
+        <w:t xml:space="preserve">5.1 Os bordões da direita</w:t>
+      </w:r>
+      <w:r>
+        <w:t xml:space="preserve">42</w:t>
+      </w:r>
+    </w:p>
+    <w:p>
+      <w:pPr>
+        <w:numPr>
+          <w:ilvl w:val="0"/>
+          <w:numId w:val="1002"/>
+        </w:numPr>
+        <w:pStyle w:val="Compact"/>
+      </w:pPr>
+      <w:r>
+        <w:t xml:space="preserve">5.2 Frases clássicas que viraram munição</w:t>
+      </w:r>
+      <w:r>
+        <w:t xml:space="preserve">43</w:t>
+      </w:r>
+    </w:p>
+    <w:p>
+      <w:pPr>
+        <w:numPr>
+          <w:ilvl w:val="0"/>
+          <w:numId w:val="1002"/>
+        </w:numPr>
+        <w:pStyle w:val="Compact"/>
+      </w:pPr>
+      <w:r>
+        <w:t xml:space="preserve">5.3 As frases deste guia</w:t>
+      </w:r>
+      <w:r>
+        <w:t xml:space="preserve">44</w:t>
+      </w:r>
+    </w:p>
+    <w:p>
+      <w:pPr>
+        <w:numPr>
+          <w:ilvl w:val="0"/>
+          <w:numId w:val="1002"/>
+        </w:numPr>
+        <w:pStyle w:val="Compact"/>
+      </w:pPr>
+      <w:r>
         <w:t xml:space="preserve">Bônus B7 · Dossiê: mais 4 anos em manchetes</w:t>
       </w:r>
       <w:r>
-        <w:t xml:space="preserve">37</w:t>
+        <w:t xml:space="preserve">45</w:t>
       </w:r>
     </w:p>
     <w:p>
@@ -868,7 +928,7 @@
         <w:t xml:space="preserve">B7 · Versão de 1 página para WhatsApp</w:t>
       </w:r>
       <w:r>
-        <w:t xml:space="preserve">46</w:t>
+        <w:t xml:space="preserve">54</w:t>
       </w:r>
     </w:p>
     <w:p>
@@ -883,7 +943,7 @@
         <w:t xml:space="preserve">Anexo · Fontes de todos os números</w:t>
       </w:r>
       <w:r>
-        <w:t xml:space="preserve">48</w:t>
+        <w:t xml:space="preserve">56</w:t>
       </w:r>
     </w:p>
     <w:p>
@@ -1988,6 +2048,60 @@
         <w:pStyle w:val="FirstParagraph"/>
       </w:pPr>
       <w:r>
+        <w:t xml:space="preserve">EXTRA!</w:t>
+      </w:r>
+    </w:p>
+    <w:p>
+      <w:pPr>
+        <w:pStyle w:val="BodyText"/>
+      </w:pPr>
+      <w:r>
+        <w:t xml:space="preserve">R$ 11</w:t>
+      </w:r>
+      <w:r>
+        <w:t xml:space="preserve"> </w:t>
+      </w:r>
+      <w:r>
+        <w:rPr>
+          <w:highlight w:val="yellow"/>
+        </w:rPr>
+        <w:t xml:space="preserve">trilhões</w:t>
+      </w:r>
+      <w:r>
+        <w:t xml:space="preserve"> </w:t>
+      </w:r>
+      <w:r>
+        <w:t xml:space="preserve">de dívida</w:t>
+      </w:r>
+    </w:p>
+    <w:p>
+      <w:pPr>
+        <w:pStyle w:val="BodyText"/>
+      </w:pPr>
+      <w:r>
+        <w:t xml:space="preserve">A conta que o governo está deixando para o seu filho e o seu neto. 82,9% do PIB, e subindo.</w:t>
+      </w:r>
+    </w:p>
+    <w:p>
+      <w:pPr>
+        <w:pStyle w:val="BodyText"/>
+      </w:pPr>
+      <w:r>
+        <w:t xml:space="preserve">QUEM PAGA?</w:t>
+      </w:r>
+    </w:p>
+    <w:p>
+      <w:r>
+        <w:pict>
+          <v:rect style="width:0;height:1.5pt" o:hralign="center" o:hrstd="t" o:hr="t"/>
+        </w:pict>
+      </w:r>
+    </w:p>
+    <w:p>
+      <w:pPr>
+        <w:pStyle w:val="FirstParagraph"/>
+      </w:pPr>
+      <w:r>
         <w:t xml:space="preserve">2</w:t>
       </w:r>
     </w:p>
@@ -3128,6 +3242,54 @@
         <w:pStyle w:val="FirstParagraph"/>
       </w:pPr>
       <w:r>
+        <w:t xml:space="preserve">EXTRA!</w:t>
+      </w:r>
+    </w:p>
+    <w:p>
+      <w:pPr>
+        <w:pStyle w:val="BodyText"/>
+      </w:pPr>
+      <w:r>
+        <w:t xml:space="preserve">83,98 milhões de</w:t>
+      </w:r>
+      <w:r>
+        <w:t xml:space="preserve"> </w:t>
+      </w:r>
+      <w:r>
+        <w:rPr>
+          <w:highlight w:val="yellow"/>
+        </w:rPr>
+        <w:t xml:space="preserve">negativados</w:t>
+      </w:r>
+    </w:p>
+    <w:p>
+      <w:pPr>
+        <w:pStyle w:val="BodyText"/>
+      </w:pPr>
+      <w:r>
+        <w:t xml:space="preserve">Maior número da história. O governo bate recorde de arrecadação e a família brasileira bate recorde de dívida.</w:t>
+      </w:r>
+    </w:p>
+    <w:p>
+      <w:pPr>
+        <w:pStyle w:val="BodyText"/>
+      </w:pPr>
+      <w:r>
+        <w:t xml:space="preserve">RECORDE</w:t>
+      </w:r>
+    </w:p>
+    <w:p>
+      <w:r>
+        <w:pict>
+          <v:rect style="width:0;height:1.5pt" o:hralign="center" o:hrstd="t" o:hr="t"/>
+        </w:pict>
+      </w:r>
+    </w:p>
+    <w:p>
+      <w:pPr>
+        <w:pStyle w:val="FirstParagraph"/>
+      </w:pPr>
+      <w:r>
         <w:t xml:space="preserve">3</w:t>
       </w:r>
     </w:p>
@@ -5045,6 +5207,54 @@
       </w:r>
     </w:p>
     <w:bookmarkEnd w:id="53"/>
+    <w:p>
+      <w:r>
+        <w:pict>
+          <v:rect style="width:0;height:1.5pt" o:hralign="center" o:hrstd="t" o:hr="t"/>
+        </w:pict>
+      </w:r>
+    </w:p>
+    <w:p>
+      <w:pPr>
+        <w:pStyle w:val="FirstParagraph"/>
+      </w:pPr>
+      <w:r>
+        <w:t xml:space="preserve">URGENTE!</w:t>
+      </w:r>
+    </w:p>
+    <w:p>
+      <w:pPr>
+        <w:pStyle w:val="BodyText"/>
+      </w:pPr>
+      <w:r>
+        <w:t xml:space="preserve">1 imposto a cada</w:t>
+      </w:r>
+      <w:r>
+        <w:t xml:space="preserve"> </w:t>
+      </w:r>
+      <w:r>
+        <w:rPr>
+          <w:highlight w:val="yellow"/>
+        </w:rPr>
+        <w:t xml:space="preserve">27 dias</w:t>
+      </w:r>
+    </w:p>
+    <w:p>
+      <w:pPr>
+        <w:pStyle w:val="BodyText"/>
+      </w:pPr>
+      <w:r>
+        <w:t xml:space="preserve">43 medidas para aumentar a carga em pouco mais de 3 anos. E agora são mais 4.</w:t>
+      </w:r>
+    </w:p>
+    <w:p>
+      <w:pPr>
+        <w:pStyle w:val="BodyText"/>
+      </w:pPr>
+      <w:r>
+        <w:t xml:space="preserve">MAIS 4 ANOS</w:t>
+      </w:r>
+    </w:p>
     <w:p>
       <w:r>
         <w:pict>
@@ -6221,36 +6431,43 @@
         <w:pStyle w:val="FirstParagraph"/>
       </w:pPr>
       <w:r>
-        <w:t xml:space="preserve">B7</w:t>
-      </w:r>
-    </w:p>
-    <w:p>
-      <w:pPr>
-        <w:pStyle w:val="BodyText"/>
-      </w:pPr>
-      <w:r>
-        <w:t xml:space="preserve">Dossiê: mais 4 anos em manchetes</w:t>
-      </w:r>
-    </w:p>
-    <w:p>
-      <w:pPr>
-        <w:pStyle w:val="BodyText"/>
-      </w:pPr>
-      <w:r>
-        <w:t xml:space="preserve">Links para mandar ao seu conhecido de esquerda. Não é opinião: é manchete, com veículo e QR code para ele mesmo conferir. O guia completo, com o método de conversa, vem de brinde:</w:t>
-      </w:r>
-      <w:r>
-        <w:t xml:space="preserve"> </w:t>
-      </w:r>
-      <w:r>
-        <w:rPr>
-          <w:bCs/>
-          <w:b/>
-        </w:rPr>
-        <w:t xml:space="preserve">Como convencer um petista</w:t>
-      </w:r>
-      <w:r>
-        <w:t xml:space="preserve">.</w:t>
+        <w:t xml:space="preserve">EXCLUSIVO!</w:t>
+      </w:r>
+    </w:p>
+    <w:p>
+      <w:pPr>
+        <w:pStyle w:val="BodyText"/>
+      </w:pPr>
+      <w:r>
+        <w:t xml:space="preserve">A Bolívia</w:t>
+      </w:r>
+      <w:r>
+        <w:t xml:space="preserve"> </w:t>
+      </w:r>
+      <w:r>
+        <w:rPr>
+          <w:highlight w:val="yellow"/>
+        </w:rPr>
+        <w:t xml:space="preserve">acordou</w:t>
+      </w:r>
+      <w:r>
+        <w:t xml:space="preserve">. E o Brasil?</w:t>
+      </w:r>
+    </w:p>
+    <w:p>
+      <w:pPr>
+        <w:pStyle w:val="BodyText"/>
+      </w:pPr>
+      <w:r>
+        <w:t xml:space="preserve">20 anos de socialismo derrubados nas urnas, com 54,6% dos votos. O país vizinho já virou a página.</w:t>
+      </w:r>
+    </w:p>
+    <w:p>
+      <w:pPr>
+        <w:pStyle w:val="BodyText"/>
+      </w:pPr>
+      <w:r>
+        <w:t xml:space="preserve">2030</w:t>
       </w:r>
     </w:p>
     <w:p>
@@ -6265,145 +6482,25 @@
         <w:pStyle w:val="FirstParagraph"/>
       </w:pPr>
       <w:r>
-        <w:t xml:space="preserve">Como usar o dossiê</w:t>
-      </w:r>
-    </w:p>
-    <w:bookmarkStart w:id="66" w:name="não-discuta.-mande-o-link."/>
-    <w:p>
-      <w:pPr>
-        <w:pStyle w:val="Heading1"/>
-      </w:pPr>
-      <w:r>
-        <w:t xml:space="preserve">Não discuta. Mande o link.</w:t>
-      </w:r>
-    </w:p>
-    <w:p>
-      <w:pPr>
-        <w:pStyle w:val="FirstParagraph"/>
-      </w:pPr>
-      <w:r>
-        <w:t xml:space="preserve">Discussão de grupo de família não convence ninguém.</w:t>
-      </w:r>
-      <w:r>
-        <w:t xml:space="preserve"> </w:t>
-      </w:r>
-      <w:r>
-        <w:rPr>
-          <w:bCs/>
-          <w:b/>
-        </w:rPr>
-        <w:t xml:space="preserve">Manchete com data e veículo</w:t>
-      </w:r>
-      <w:r>
-        <w:t xml:space="preserve"> </w:t>
-      </w:r>
-      <w:r>
-        <w:t xml:space="preserve">convence mais. Este dossiê é para isso.</w:t>
-      </w:r>
-    </w:p>
-    <w:p>
-      <w:pPr>
-        <w:numPr>
-          <w:ilvl w:val="0"/>
-          <w:numId w:val="1018"/>
-        </w:numPr>
-        <w:pStyle w:val="Compact"/>
-      </w:pPr>
-      <w:r>
-        <w:t xml:space="preserve">Escolha 1 ou 2 manchetes sobre o assunto da conversa</w:t>
-      </w:r>
-    </w:p>
-    <w:p>
-      <w:pPr>
-        <w:numPr>
-          <w:ilvl w:val="0"/>
-          <w:numId w:val="1018"/>
-        </w:numPr>
-        <w:pStyle w:val="Compact"/>
-      </w:pPr>
-      <w:r>
-        <w:t xml:space="preserve">Aponte a câmera do celular para o QR code e copie o link</w:t>
-      </w:r>
-    </w:p>
-    <w:p>
-      <w:pPr>
-        <w:numPr>
-          <w:ilvl w:val="0"/>
-          <w:numId w:val="1018"/>
-        </w:numPr>
-        <w:pStyle w:val="Compact"/>
-      </w:pPr>
-      <w:r>
-        <w:t xml:space="preserve">Mande o link, sem textão. Deixe a notícia falar</w:t>
-      </w:r>
-    </w:p>
-    <w:p>
-      <w:pPr>
-        <w:numPr>
-          <w:ilvl w:val="0"/>
-          <w:numId w:val="1018"/>
-        </w:numPr>
-        <w:pStyle w:val="Compact"/>
-      </w:pPr>
-      <w:r>
-        <w:t xml:space="preserve">Se ele disser “site de direita”, mande o dado oficial que está na mesma linha (Banco Central, Senado, Receita)</w:t>
-      </w:r>
-    </w:p>
-    <w:bookmarkStart w:id="64" w:name="já-aconteceu"/>
-    <w:p>
-      <w:pPr>
-        <w:pStyle w:val="Heading3"/>
-      </w:pPr>
-      <w:r>
-        <w:t xml:space="preserve">Já aconteceu</w:t>
-      </w:r>
-    </w:p>
-    <w:p>
-      <w:pPr>
-        <w:pStyle w:val="FirstParagraph"/>
-      </w:pPr>
-      <w:r>
-        <w:t xml:space="preserve">Fatos publicados: impostos, IOF, dívida, juros, déficit, golpes.</w:t>
-      </w:r>
-    </w:p>
-    <w:bookmarkEnd w:id="64"/>
-    <w:bookmarkStart w:id="65" w:name="o-que-vem-por-aí"/>
-    <w:p>
-      <w:pPr>
-        <w:pStyle w:val="Heading3"/>
-      </w:pPr>
-      <w:r>
-        <w:t xml:space="preserve">O que vem por aí</w:t>
-      </w:r>
-    </w:p>
-    <w:p>
-      <w:pPr>
-        <w:pStyle w:val="FirstParagraph"/>
-      </w:pPr>
-      <w:r>
-        <w:t xml:space="preserve">Projeções de instituições e propostas do governo, marcadas como projeção.</w:t>
-      </w:r>
-    </w:p>
-    <w:bookmarkEnd w:id="65"/>
-    <w:p>
-      <w:pPr>
-        <w:pStyle w:val="BodyText"/>
-      </w:pPr>
-      <w:r>
-        <w:rPr>
-          <w:bCs/>
-          <w:b/>
-        </w:rPr>
-        <w:t xml:space="preserve">Links mudam.</w:t>
-      </w:r>
-      <w:r>
-        <w:t xml:space="preserve"> </w:t>
-      </w:r>
-      <w:r>
-        <w:t xml:space="preserve">Todos foram consultados em 28/10/2026. Se algum sair do ar, busque o título entre aspas.</w:t>
-      </w:r>
-    </w:p>
-    <w:bookmarkEnd w:id="66"/>
+        <w:t xml:space="preserve">5</w:t>
+      </w:r>
+    </w:p>
+    <w:p>
+      <w:pPr>
+        <w:pStyle w:val="BodyText"/>
+      </w:pPr>
+      <w:r>
+        <w:t xml:space="preserve">Frases de efeito para print</w:t>
+      </w:r>
+    </w:p>
+    <w:p>
+      <w:pPr>
+        <w:pStyle w:val="BodyText"/>
+      </w:pPr>
+      <w:r>
+        <w:t xml:space="preserve">Os bordões mais usados pela direita, as frases clássicas que viraram munição no mundo todo e as frases deste guia. Tire print e dispare.</w:t>
+      </w:r>
+    </w:p>
     <w:p>
       <w:r>
         <w:pict>
@@ -6416,10 +6513,522 @@
         <w:pStyle w:val="FirstParagraph"/>
       </w:pPr>
       <w:r>
+        <w:t xml:space="preserve">Bordões</w:t>
+      </w:r>
+    </w:p>
+    <w:bookmarkStart w:id="64" w:name="os-bordões-da-direita"/>
+    <w:p>
+      <w:pPr>
+        <w:pStyle w:val="Heading1"/>
+      </w:pPr>
+      <w:r>
+        <w:t xml:space="preserve">Os bordões da direita</w:t>
+      </w:r>
+    </w:p>
+    <w:p>
+      <w:pPr>
+        <w:pStyle w:val="FirstParagraph"/>
+      </w:pPr>
+      <w:r>
+        <w:t xml:space="preserve">Deus, pátria, família e liberdade</w:t>
+      </w:r>
+    </w:p>
+    <w:p>
+      <w:pPr>
+        <w:pStyle w:val="BodyText"/>
+      </w:pPr>
+      <w:r>
+        <w:t xml:space="preserve">Brasil acima de tudo, Deus acima de todos</w:t>
+      </w:r>
+    </w:p>
+    <w:p>
+      <w:pPr>
+        <w:pStyle w:val="BodyText"/>
+      </w:pPr>
+      <w:r>
+        <w:t xml:space="preserve">Nossa bandeira jamais será vermelha</w:t>
+      </w:r>
+    </w:p>
+    <w:p>
+      <w:pPr>
+        <w:pStyle w:val="BodyText"/>
+      </w:pPr>
+      <w:r>
+        <w:t xml:space="preserve">Mais Brasil, menos Brasília</w:t>
+      </w:r>
+    </w:p>
+    <w:p>
+      <w:pPr>
+        <w:pStyle w:val="BodyText"/>
+      </w:pPr>
+      <w:r>
+        <w:t xml:space="preserve">Imposto é roubo</w:t>
+      </w:r>
+    </w:p>
+    <w:p>
+      <w:pPr>
+        <w:pStyle w:val="BodyText"/>
+      </w:pPr>
+      <w:r>
+        <w:t xml:space="preserve">Cadê a picanha?</w:t>
+      </w:r>
+    </w:p>
+    <w:p>
+      <w:pPr>
+        <w:pStyle w:val="BodyText"/>
+      </w:pPr>
+      <w:r>
+        <w:t xml:space="preserve">Fez o L? Agora paga a conta</w:t>
+      </w:r>
+    </w:p>
+    <w:p>
+      <w:pPr>
+        <w:pStyle w:val="BodyText"/>
+      </w:pPr>
+      <w:r>
+        <w:t xml:space="preserve">Taxad ataca de novo</w:t>
+      </w:r>
+    </w:p>
+    <w:p>
+      <w:pPr>
+        <w:pStyle w:val="BodyText"/>
+      </w:pPr>
+      <w:r>
+        <w:t xml:space="preserve">Comunista de iPhone</w:t>
+      </w:r>
+    </w:p>
+    <w:p>
+      <w:pPr>
+        <w:pStyle w:val="BodyText"/>
+      </w:pPr>
+      <w:r>
+        <w:t xml:space="preserve">Liberdade não se negocia</w:t>
+      </w:r>
+    </w:p>
+    <w:p>
+      <w:pPr>
+        <w:pStyle w:val="BodyText"/>
+      </w:pPr>
+      <w:r>
+        <w:t xml:space="preserve">Ama o socialismo? Vai pra Cuba</w:t>
+      </w:r>
+    </w:p>
+    <w:p>
+      <w:pPr>
+        <w:pStyle w:val="BodyText"/>
+      </w:pPr>
+      <w:r>
+        <w:t xml:space="preserve">O Brasil é verde e amarelo</w:t>
+      </w:r>
+    </w:p>
+    <w:bookmarkEnd w:id="64"/>
+    <w:p>
+      <w:r>
+        <w:pict>
+          <v:rect style="width:0;height:1.5pt" o:hralign="center" o:hrstd="t" o:hr="t"/>
+        </w:pict>
+      </w:r>
+    </w:p>
+    <w:p>
+      <w:pPr>
+        <w:pStyle w:val="FirstParagraph"/>
+      </w:pPr>
+      <w:r>
+        <w:t xml:space="preserve">Clássicos</w:t>
+      </w:r>
+    </w:p>
+    <w:bookmarkStart w:id="65" w:name="frases-que-viraram-munição-no-mundo-todo"/>
+    <w:p>
+      <w:pPr>
+        <w:pStyle w:val="Heading1"/>
+      </w:pPr>
+      <w:r>
+        <w:t xml:space="preserve">Frases que viraram munição no mundo todo</w:t>
+      </w:r>
+    </w:p>
+    <w:p>
+      <w:pPr>
+        <w:pStyle w:val="FirstParagraph"/>
+      </w:pPr>
+      <w:r>
+        <w:t xml:space="preserve">O problema do socialismo é que um dia acaba o dinheiro dos outros</w:t>
+      </w:r>
+      <w:r>
+        <w:t xml:space="preserve">Margaret Thatcher</w:t>
+      </w:r>
+    </w:p>
+    <w:p>
+      <w:pPr>
+        <w:pStyle w:val="BodyText"/>
+      </w:pPr>
+      <w:r>
+        <w:t xml:space="preserve">Não existe almoço grátis</w:t>
+      </w:r>
+      <w:r>
+        <w:t xml:space="preserve">Milton Friedman</w:t>
+      </w:r>
+    </w:p>
+    <w:p>
+      <w:pPr>
+        <w:pStyle w:val="BodyText"/>
+      </w:pPr>
+      <w:r>
+        <w:t xml:space="preserve">O governo não é a solução para o nosso problema; o governo é o problema</w:t>
+      </w:r>
+      <w:r>
+        <w:t xml:space="preserve">Ronald Reagan, posse em 1981</w:t>
+      </w:r>
+    </w:p>
+    <w:p>
+      <w:pPr>
+        <w:pStyle w:val="BodyText"/>
+      </w:pPr>
+      <w:r>
+        <w:t xml:space="preserve">¡Viva la libertad, carajo!</w:t>
+      </w:r>
+      <w:r>
+        <w:t xml:space="preserve">Javier Milei</w:t>
+      </w:r>
+    </w:p>
+    <w:p>
+      <w:pPr>
+        <w:pStyle w:val="BodyText"/>
+      </w:pPr>
+      <w:r>
+        <w:t xml:space="preserve">O Estado é a grande ficção pela qual todos tentam viver à custa de todos</w:t>
+      </w:r>
+      <w:r>
+        <w:t xml:space="preserve">Frédéric Bastiat</w:t>
+      </w:r>
+    </w:p>
+    <w:p>
+      <w:pPr>
+        <w:pStyle w:val="BodyText"/>
+      </w:pPr>
+      <w:r>
+        <w:t xml:space="preserve">O vício do capitalismo é a divisão desigual das bênçãos. A virtude do socialismo é a divisão igual das misérias</w:t>
+      </w:r>
+      <w:r>
+        <w:t xml:space="preserve">Winston Churchill</w:t>
+      </w:r>
+    </w:p>
+    <w:bookmarkEnd w:id="65"/>
+    <w:p>
+      <w:r>
+        <w:pict>
+          <v:rect style="width:0;height:1.5pt" o:hralign="center" o:hrstd="t" o:hr="t"/>
+        </w:pict>
+      </w:r>
+    </w:p>
+    <w:p>
+      <w:pPr>
+        <w:pStyle w:val="FirstParagraph"/>
+      </w:pPr>
+      <w:r>
+        <w:t xml:space="preserve">Exclusivas</w:t>
+      </w:r>
+    </w:p>
+    <w:bookmarkStart w:id="66" w:name="as-frases-deste-guia"/>
+    <w:p>
+      <w:pPr>
+        <w:pStyle w:val="Heading1"/>
+      </w:pPr>
+      <w:r>
+        <w:t xml:space="preserve">As frases deste guia</w:t>
+      </w:r>
+    </w:p>
+    <w:p>
+      <w:pPr>
+        <w:pStyle w:val="FirstParagraph"/>
+      </w:pPr>
+      <w:r>
+        <w:t xml:space="preserve">Governo rico, família falida</w:t>
+      </w:r>
+    </w:p>
+    <w:p>
+      <w:pPr>
+        <w:pStyle w:val="BodyText"/>
+      </w:pPr>
+      <w:r>
+        <w:t xml:space="preserve">Anulado não é inocente</w:t>
+      </w:r>
+    </w:p>
+    <w:p>
+      <w:pPr>
+        <w:pStyle w:val="BodyText"/>
+      </w:pPr>
+      <w:r>
+        <w:t xml:space="preserve">Emprego com dívida recorde é escravo do boleto</w:t>
+      </w:r>
+    </w:p>
+    <w:p>
+      <w:pPr>
+        <w:pStyle w:val="BodyText"/>
+      </w:pPr>
+      <w:r>
+        <w:t xml:space="preserve">Petista ama o socialismo. De longe</w:t>
+      </w:r>
+    </w:p>
+    <w:p>
+      <w:pPr>
+        <w:pStyle w:val="BodyText"/>
+      </w:pPr>
+      <w:r>
+        <w:t xml:space="preserve">“Taxar os ricos” é meter a mão no seu bolso</w:t>
+      </w:r>
+    </w:p>
+    <w:p>
+      <w:pPr>
+        <w:pStyle w:val="BodyText"/>
+      </w:pPr>
+      <w:r>
+        <w:t xml:space="preserve">Ninguém foge de onde está bem</w:t>
+      </w:r>
+    </w:p>
+    <w:p>
+      <w:pPr>
+        <w:pStyle w:val="BodyText"/>
+      </w:pPr>
+      <w:r>
+        <w:t xml:space="preserve">Quem rotula já perdeu o argumento</w:t>
+      </w:r>
+    </w:p>
+    <w:p>
+      <w:pPr>
+        <w:pStyle w:val="BodyText"/>
+      </w:pPr>
+      <w:r>
+        <w:t xml:space="preserve">Crescer devendo não é crescer</w:t>
+      </w:r>
+    </w:p>
+    <w:p>
+      <w:pPr>
+        <w:pStyle w:val="BodyText"/>
+      </w:pPr>
+      <w:r>
+        <w:t xml:space="preserve">Se a Bolívia acordou, o Brasil também pode</w:t>
+      </w:r>
+    </w:p>
+    <w:p>
+      <w:pPr>
+        <w:pStyle w:val="BodyText"/>
+      </w:pPr>
+      <w:r>
+        <w:t xml:space="preserve">Eles não mudaram a direção. Mude você</w:t>
+      </w:r>
+    </w:p>
+    <w:bookmarkEnd w:id="66"/>
+    <w:p>
+      <w:r>
+        <w:pict>
+          <v:rect style="width:0;height:1.5pt" o:hralign="center" o:hrstd="t" o:hr="t"/>
+        </w:pict>
+      </w:r>
+    </w:p>
+    <w:p>
+      <w:pPr>
+        <w:pStyle w:val="FirstParagraph"/>
+      </w:pPr>
+      <w:r>
+        <w:t xml:space="preserve">B7</w:t>
+      </w:r>
+    </w:p>
+    <w:p>
+      <w:pPr>
+        <w:pStyle w:val="BodyText"/>
+      </w:pPr>
+      <w:r>
+        <w:t xml:space="preserve">Dossiê: mais 4 anos em manchetes</w:t>
+      </w:r>
+    </w:p>
+    <w:p>
+      <w:pPr>
+        <w:pStyle w:val="BodyText"/>
+      </w:pPr>
+      <w:r>
+        <w:t xml:space="preserve">Links para mandar ao seu conhecido de esquerda. Não é opinião: é manchete, com veículo e QR code para ele mesmo conferir. O guia completo, com o método de conversa, vem de brinde:</w:t>
+      </w:r>
+      <w:r>
+        <w:t xml:space="preserve"> </w:t>
+      </w:r>
+      <w:r>
+        <w:rPr>
+          <w:bCs/>
+          <w:b/>
+        </w:rPr>
+        <w:t xml:space="preserve">Como convencer um petista</w:t>
+      </w:r>
+      <w:r>
+        <w:t xml:space="preserve">.</w:t>
+      </w:r>
+    </w:p>
+    <w:p>
+      <w:r>
+        <w:pict>
+          <v:rect style="width:0;height:1.5pt" o:hralign="center" o:hrstd="t" o:hr="t"/>
+        </w:pict>
+      </w:r>
+    </w:p>
+    <w:p>
+      <w:pPr>
+        <w:pStyle w:val="FirstParagraph"/>
+      </w:pPr>
+      <w:r>
+        <w:t xml:space="preserve">Como usar o dossiê</w:t>
+      </w:r>
+    </w:p>
+    <w:bookmarkStart w:id="69" w:name="não-discuta.-mande-o-link."/>
+    <w:p>
+      <w:pPr>
+        <w:pStyle w:val="Heading1"/>
+      </w:pPr>
+      <w:r>
+        <w:t xml:space="preserve">Não discuta. Mande o link.</w:t>
+      </w:r>
+    </w:p>
+    <w:p>
+      <w:pPr>
+        <w:pStyle w:val="FirstParagraph"/>
+      </w:pPr>
+      <w:r>
+        <w:t xml:space="preserve">Discussão de grupo de família não convence ninguém.</w:t>
+      </w:r>
+      <w:r>
+        <w:t xml:space="preserve"> </w:t>
+      </w:r>
+      <w:r>
+        <w:rPr>
+          <w:bCs/>
+          <w:b/>
+        </w:rPr>
+        <w:t xml:space="preserve">Manchete com data e veículo</w:t>
+      </w:r>
+      <w:r>
+        <w:t xml:space="preserve"> </w:t>
+      </w:r>
+      <w:r>
+        <w:t xml:space="preserve">convence mais. Este dossiê é para isso.</w:t>
+      </w:r>
+    </w:p>
+    <w:p>
+      <w:pPr>
+        <w:numPr>
+          <w:ilvl w:val="0"/>
+          <w:numId w:val="1018"/>
+        </w:numPr>
+        <w:pStyle w:val="Compact"/>
+      </w:pPr>
+      <w:r>
+        <w:t xml:space="preserve">Escolha 1 ou 2 manchetes sobre o assunto da conversa</w:t>
+      </w:r>
+    </w:p>
+    <w:p>
+      <w:pPr>
+        <w:numPr>
+          <w:ilvl w:val="0"/>
+          <w:numId w:val="1018"/>
+        </w:numPr>
+        <w:pStyle w:val="Compact"/>
+      </w:pPr>
+      <w:r>
+        <w:t xml:space="preserve">Aponte a câmera do celular para o QR code e copie o link</w:t>
+      </w:r>
+    </w:p>
+    <w:p>
+      <w:pPr>
+        <w:numPr>
+          <w:ilvl w:val="0"/>
+          <w:numId w:val="1018"/>
+        </w:numPr>
+        <w:pStyle w:val="Compact"/>
+      </w:pPr>
+      <w:r>
+        <w:t xml:space="preserve">Mande o link, sem textão. Deixe a notícia falar</w:t>
+      </w:r>
+    </w:p>
+    <w:p>
+      <w:pPr>
+        <w:numPr>
+          <w:ilvl w:val="0"/>
+          <w:numId w:val="1018"/>
+        </w:numPr>
+        <w:pStyle w:val="Compact"/>
+      </w:pPr>
+      <w:r>
+        <w:t xml:space="preserve">Se ele disser “site de direita”, mande o dado oficial que está na mesma linha (Banco Central, Senado, Receita)</w:t>
+      </w:r>
+    </w:p>
+    <w:bookmarkStart w:id="67" w:name="já-aconteceu"/>
+    <w:p>
+      <w:pPr>
+        <w:pStyle w:val="Heading3"/>
+      </w:pPr>
+      <w:r>
+        <w:t xml:space="preserve">Já aconteceu</w:t>
+      </w:r>
+    </w:p>
+    <w:p>
+      <w:pPr>
+        <w:pStyle w:val="FirstParagraph"/>
+      </w:pPr>
+      <w:r>
+        <w:t xml:space="preserve">Fatos publicados: impostos, IOF, dívida, juros, déficit, golpes.</w:t>
+      </w:r>
+    </w:p>
+    <w:bookmarkEnd w:id="67"/>
+    <w:bookmarkStart w:id="68" w:name="o-que-vem-por-aí"/>
+    <w:p>
+      <w:pPr>
+        <w:pStyle w:val="Heading3"/>
+      </w:pPr>
+      <w:r>
+        <w:t xml:space="preserve">O que vem por aí</w:t>
+      </w:r>
+    </w:p>
+    <w:p>
+      <w:pPr>
+        <w:pStyle w:val="FirstParagraph"/>
+      </w:pPr>
+      <w:r>
+        <w:t xml:space="preserve">Projeções de instituições e propostas do governo, marcadas como projeção.</w:t>
+      </w:r>
+    </w:p>
+    <w:bookmarkEnd w:id="68"/>
+    <w:p>
+      <w:pPr>
+        <w:pStyle w:val="BodyText"/>
+      </w:pPr>
+      <w:r>
+        <w:rPr>
+          <w:bCs/>
+          <w:b/>
+        </w:rPr>
+        <w:t xml:space="preserve">Links mudam.</w:t>
+      </w:r>
+      <w:r>
+        <w:t xml:space="preserve"> </w:t>
+      </w:r>
+      <w:r>
+        <w:t xml:space="preserve">Todos foram consultados em 28/10/2026. Se algum sair do ar, busque o título entre aspas.</w:t>
+      </w:r>
+    </w:p>
+    <w:bookmarkEnd w:id="69"/>
+    <w:p>
+      <w:r>
+        <w:pict>
+          <v:rect style="width:0;height:1.5pt" o:hralign="center" o:hrstd="t" o:hr="t"/>
+        </w:pict>
+      </w:r>
+    </w:p>
+    <w:p>
+      <w:pPr>
+        <w:pStyle w:val="FirstParagraph"/>
+      </w:pPr>
+      <w:r>
         <w:t xml:space="preserve">Fatos publicados</w:t>
       </w:r>
     </w:p>
-    <w:bookmarkStart w:id="70" w:name="já-aconteceu-1"/>
+    <w:bookmarkStart w:id="73" w:name="já-aconteceu-1"/>
     <w:p>
       <w:pPr>
         <w:pStyle w:val="Heading2"/>
@@ -6443,7 +7052,7 @@
       <w:pPr>
         <w:pStyle w:val="BodyText"/>
       </w:pPr>
-      <w:hyperlink r:id="rId67">
+      <w:hyperlink r:id="rId70">
         <w:r>
           <w:rPr>
             <w:rStyle w:val="Hyperlink"/>
@@ -6493,7 +7102,7 @@
       <w:pPr>
         <w:pStyle w:val="BodyText"/>
       </w:pPr>
-      <w:hyperlink r:id="rId68">
+      <w:hyperlink r:id="rId71">
         <w:r>
           <w:rPr>
             <w:rStyle w:val="Hyperlink"/>
@@ -6543,7 +7152,7 @@
       <w:pPr>
         <w:pStyle w:val="BodyText"/>
       </w:pPr>
-      <w:hyperlink r:id="rId69">
+      <w:hyperlink r:id="rId72">
         <w:r>
           <w:rPr>
             <w:rStyle w:val="Hyperlink"/>
@@ -6578,7 +7187,7 @@
         <w:t xml:space="preserve">· link consultado em 28/10/2026</w:t>
       </w:r>
     </w:p>
-    <w:bookmarkEnd w:id="70"/>
+    <w:bookmarkEnd w:id="73"/>
     <w:p>
       <w:r>
         <w:pict>
@@ -6586,7 +7195,7 @@
         </w:pict>
       </w:r>
     </w:p>
-    <w:bookmarkStart w:id="74" w:name="já-aconteceu-cont."/>
+    <w:bookmarkStart w:id="77" w:name="já-aconteceu-cont."/>
     <w:p>
       <w:pPr>
         <w:pStyle w:val="Heading2"/>
@@ -6610,7 +7219,7 @@
       <w:pPr>
         <w:pStyle w:val="BodyText"/>
       </w:pPr>
-      <w:hyperlink r:id="rId71">
+      <w:hyperlink r:id="rId74">
         <w:r>
           <w:rPr>
             <w:rStyle w:val="Hyperlink"/>
@@ -6660,7 +7269,7 @@
       <w:pPr>
         <w:pStyle w:val="BodyText"/>
       </w:pPr>
-      <w:hyperlink r:id="rId72">
+      <w:hyperlink r:id="rId75">
         <w:r>
           <w:rPr>
             <w:rStyle w:val="Hyperlink"/>
@@ -6710,7 +7319,7 @@
       <w:pPr>
         <w:pStyle w:val="BodyText"/>
       </w:pPr>
-      <w:hyperlink r:id="rId73">
+      <w:hyperlink r:id="rId76">
         <w:r>
           <w:rPr>
             <w:rStyle w:val="Hyperlink"/>
@@ -6745,7 +7354,7 @@
         <w:t xml:space="preserve">· link consultado em 28/10/2026</w:t>
       </w:r>
     </w:p>
-    <w:bookmarkEnd w:id="74"/>
+    <w:bookmarkEnd w:id="77"/>
     <w:p>
       <w:r>
         <w:pict>
@@ -6753,7 +7362,7 @@
         </w:pict>
       </w:r>
     </w:p>
-    <w:bookmarkStart w:id="78" w:name="já-aconteceu-cont.-1"/>
+    <w:bookmarkStart w:id="81" w:name="já-aconteceu-cont.-1"/>
     <w:p>
       <w:pPr>
         <w:pStyle w:val="Heading2"/>
@@ -6777,7 +7386,7 @@
       <w:pPr>
         <w:pStyle w:val="BodyText"/>
       </w:pPr>
-      <w:hyperlink r:id="rId75">
+      <w:hyperlink r:id="rId78">
         <w:r>
           <w:rPr>
             <w:rStyle w:val="Hyperlink"/>
@@ -6827,7 +7436,7 @@
       <w:pPr>
         <w:pStyle w:val="BodyText"/>
       </w:pPr>
-      <w:hyperlink r:id="rId76">
+      <w:hyperlink r:id="rId79">
         <w:r>
           <w:rPr>
             <w:rStyle w:val="Hyperlink"/>
@@ -6877,7 +7486,7 @@
       <w:pPr>
         <w:pStyle w:val="BodyText"/>
       </w:pPr>
-      <w:hyperlink r:id="rId77">
+      <w:hyperlink r:id="rId80">
         <w:r>
           <w:rPr>
             <w:rStyle w:val="Hyperlink"/>
@@ -6912,7 +7521,7 @@
         <w:t xml:space="preserve">· link consultado em 28/10/2026</w:t>
       </w:r>
     </w:p>
-    <w:bookmarkEnd w:id="78"/>
+    <w:bookmarkEnd w:id="81"/>
     <w:p>
       <w:r>
         <w:pict>
@@ -6920,7 +7529,7 @@
         </w:pict>
       </w:r>
     </w:p>
-    <w:bookmarkStart w:id="82" w:name="já-aconteceu-cont.-2"/>
+    <w:bookmarkStart w:id="85" w:name="já-aconteceu-cont.-2"/>
     <w:p>
       <w:pPr>
         <w:pStyle w:val="Heading2"/>
@@ -6944,7 +7553,7 @@
       <w:pPr>
         <w:pStyle w:val="BodyText"/>
       </w:pPr>
-      <w:hyperlink r:id="rId79">
+      <w:hyperlink r:id="rId82">
         <w:r>
           <w:rPr>
             <w:rStyle w:val="Hyperlink"/>
@@ -6994,7 +7603,7 @@
       <w:pPr>
         <w:pStyle w:val="BodyText"/>
       </w:pPr>
-      <w:hyperlink r:id="rId80">
+      <w:hyperlink r:id="rId83">
         <w:r>
           <w:rPr>
             <w:rStyle w:val="Hyperlink"/>
@@ -7044,7 +7653,7 @@
       <w:pPr>
         <w:pStyle w:val="BodyText"/>
       </w:pPr>
-      <w:hyperlink r:id="rId81">
+      <w:hyperlink r:id="rId84">
         <w:r>
           <w:rPr>
             <w:rStyle w:val="Hyperlink"/>
@@ -7079,7 +7688,7 @@
         <w:t xml:space="preserve">· link consultado em 28/10/2026</w:t>
       </w:r>
     </w:p>
-    <w:bookmarkEnd w:id="82"/>
+    <w:bookmarkEnd w:id="85"/>
     <w:p>
       <w:r>
         <w:pict>
@@ -7095,7 +7704,7 @@
         <w:t xml:space="preserve">Projeções e propostas</w:t>
       </w:r>
     </w:p>
-    <w:bookmarkStart w:id="86" w:name="o-que-vem-por-aí-1"/>
+    <w:bookmarkStart w:id="89" w:name="o-que-vem-por-aí-1"/>
     <w:p>
       <w:pPr>
         <w:pStyle w:val="Heading2"/>
@@ -7119,7 +7728,7 @@
       <w:pPr>
         <w:pStyle w:val="BodyText"/>
       </w:pPr>
-      <w:hyperlink r:id="rId83">
+      <w:hyperlink r:id="rId86">
         <w:r>
           <w:rPr>
             <w:rStyle w:val="Hyperlink"/>
@@ -7169,7 +7778,7 @@
       <w:pPr>
         <w:pStyle w:val="BodyText"/>
       </w:pPr>
-      <w:hyperlink r:id="rId84">
+      <w:hyperlink r:id="rId87">
         <w:r>
           <w:rPr>
             <w:rStyle w:val="Hyperlink"/>
@@ -7219,7 +7828,7 @@
       <w:pPr>
         <w:pStyle w:val="BodyText"/>
       </w:pPr>
-      <w:hyperlink r:id="rId85">
+      <w:hyperlink r:id="rId88">
         <w:r>
           <w:rPr>
             <w:rStyle w:val="Hyperlink"/>
@@ -7254,7 +7863,7 @@
         <w:t xml:space="preserve">· link consultado em 28/10/2026</w:t>
       </w:r>
     </w:p>
-    <w:bookmarkEnd w:id="86"/>
+    <w:bookmarkEnd w:id="89"/>
     <w:p>
       <w:r>
         <w:pict>
@@ -7262,7 +7871,7 @@
         </w:pict>
       </w:r>
     </w:p>
-    <w:bookmarkStart w:id="90" w:name="o-que-vem-por-aí-cont."/>
+    <w:bookmarkStart w:id="93" w:name="o-que-vem-por-aí-cont."/>
     <w:p>
       <w:pPr>
         <w:pStyle w:val="Heading2"/>
@@ -7286,7 +7895,7 @@
       <w:pPr>
         <w:pStyle w:val="BodyText"/>
       </w:pPr>
-      <w:hyperlink r:id="rId87">
+      <w:hyperlink r:id="rId90">
         <w:r>
           <w:rPr>
             <w:rStyle w:val="Hyperlink"/>
@@ -7336,7 +7945,7 @@
       <w:pPr>
         <w:pStyle w:val="BodyText"/>
       </w:pPr>
-      <w:hyperlink r:id="rId88">
+      <w:hyperlink r:id="rId91">
         <w:r>
           <w:rPr>
             <w:rStyle w:val="Hyperlink"/>
@@ -7386,7 +7995,7 @@
       <w:pPr>
         <w:pStyle w:val="BodyText"/>
       </w:pPr>
-      <w:hyperlink r:id="rId89">
+      <w:hyperlink r:id="rId92">
         <w:r>
           <w:rPr>
             <w:rStyle w:val="Hyperlink"/>
@@ -7421,7 +8030,7 @@
         <w:t xml:space="preserve">· link consultado em 28/10/2026</w:t>
       </w:r>
     </w:p>
-    <w:bookmarkEnd w:id="90"/>
+    <w:bookmarkEnd w:id="93"/>
     <w:p>
       <w:r>
         <w:pict>
@@ -7429,7 +8038,7 @@
         </w:pict>
       </w:r>
     </w:p>
-    <w:bookmarkStart w:id="92" w:name="o-que-vem-por-aí-cont.-1"/>
+    <w:bookmarkStart w:id="95" w:name="o-que-vem-por-aí-cont.-1"/>
     <w:p>
       <w:pPr>
         <w:pStyle w:val="Heading2"/>
@@ -7453,7 +8062,7 @@
       <w:pPr>
         <w:pStyle w:val="BodyText"/>
       </w:pPr>
-      <w:hyperlink r:id="rId91">
+      <w:hyperlink r:id="rId94">
         <w:r>
           <w:rPr>
             <w:rStyle w:val="Hyperlink"/>
@@ -7488,7 +8097,7 @@
         <w:t xml:space="preserve">· link consultado em 28/10/2026</w:t>
       </w:r>
     </w:p>
-    <w:bookmarkEnd w:id="92"/>
+    <w:bookmarkEnd w:id="95"/>
     <w:p>
       <w:r>
         <w:pict>
@@ -7504,7 +8113,7 @@
         <w:t xml:space="preserve">Para o WhatsApp</w:t>
       </w:r>
     </w:p>
-    <w:bookmarkStart w:id="93" w:name="mais-4-anos-em-6-números"/>
+    <w:bookmarkStart w:id="96" w:name="mais-4-anos-em-6-números"/>
     <w:p>
       <w:pPr>
         <w:pStyle w:val="Heading1"/>
@@ -7605,7 +8214,7 @@
         <w:t xml:space="preserve">[LINK DO CURSO]</w:t>
       </w:r>
     </w:p>
-    <w:bookmarkEnd w:id="93"/>
+    <w:bookmarkEnd w:id="96"/>
     <w:p>
       <w:r>
         <w:pict>
@@ -7621,7 +8230,7 @@
         <w:t xml:space="preserve">E agora?</w:t>
       </w:r>
     </w:p>
-    <w:bookmarkStart w:id="94" w:name="ele-leu.-e-você-vai-ficar-parado"/>
+    <w:bookmarkStart w:id="97" w:name="ele-leu.-e-você-vai-ficar-parado"/>
     <w:p>
       <w:pPr>
         <w:pStyle w:val="Heading1"/>
@@ -7735,7 +8344,7 @@
         <w:t xml:space="preserve">— PATRIOTA ANÔNIMO</w:t>
       </w:r>
     </w:p>
-    <w:bookmarkEnd w:id="94"/>
+    <w:bookmarkEnd w:id="97"/>
     <w:p>
       <w:r>
         <w:pict>
@@ -7751,7 +8360,7 @@
         <w:t xml:space="preserve">Anexo</w:t>
       </w:r>
     </w:p>
-    <w:bookmarkStart w:id="95" w:name="fontes-de-todos-os-números"/>
+    <w:bookmarkStart w:id="98" w:name="fontes-de-todos-os-números"/>
     <w:p>
       <w:pPr>
         <w:pStyle w:val="Heading2"/>
@@ -7819,9 +8428,47 @@
           <w:bCs/>
           <w:b/>
         </w:rPr>
+        <w:t xml:space="preserve">p. 11</w:t>
+      </w:r>
+      <w:r>
+        <w:t xml:space="preserve">Banco Central via Gazeta do Povo e Revista Oeste (R$ 11 tri; 82,9% do PIB, ago/2026).</w:t>
+      </w:r>
+    </w:p>
+    <w:p>
+      <w:pPr>
+        <w:numPr>
+          <w:ilvl w:val="0"/>
+          <w:numId w:val="1020"/>
+        </w:numPr>
+        <w:pStyle w:val="Compact"/>
+      </w:pPr>
+      <w:r>
+        <w:rPr>
+          <w:bCs/>
+          <w:b/>
+        </w:rPr>
         <w:t xml:space="preserve">p. 18</w:t>
       </w:r>
       <w:r>
+        <w:t xml:space="preserve">Serasa via Mix Vale (83,98 milhões de inadimplentes, ago/2026).</w:t>
+      </w:r>
+    </w:p>
+    <w:p>
+      <w:pPr>
+        <w:numPr>
+          <w:ilvl w:val="0"/>
+          <w:numId w:val="1020"/>
+        </w:numPr>
+        <w:pStyle w:val="Compact"/>
+      </w:pPr>
+      <w:r>
+        <w:rPr>
+          <w:bCs/>
+          <w:b/>
+        </w:rPr>
+        <w:t xml:space="preserve">p. 20</w:t>
+      </w:r>
+      <w:r>
         <w:t xml:space="preserve">Gazeta do Povo (arrecadação 2025); Banco Central via Mix Vale, 29/09/2026 (endividamento de 49,9% da renda, jul/2026); Serasa via Mix Vale (83,98 milhões de inadimplentes, ago/2026, maior da série).</w:t>
       </w:r>
     </w:p>
@@ -7838,7 +8485,7 @@
           <w:bCs/>
           <w:b/>
         </w:rPr>
-        <w:t xml:space="preserve">p. 19</w:t>
+        <w:t xml:space="preserve">p. 21</w:t>
       </w:r>
       <w:r>
         <w:t xml:space="preserve">IBGE, PNAD Contínua, via Mix Vale (desocupação de 5,3%, trimestre até ago/2026); Peic/CNC e Serasa via Mix Vale (jul/2026).</w:t>
@@ -7857,7 +8504,7 @@
           <w:bCs/>
           <w:b/>
         </w:rPr>
-        <w:t xml:space="preserve">p. 20</w:t>
+        <w:t xml:space="preserve">p. 22</w:t>
       </w:r>
       <w:r>
         <w:t xml:space="preserve">Poder360 (IOF de 3,5% no cartão internacional); Decretos 12.466 e 12.499/2025; Gazeta do Povo, mar/2026 (43 medidas; uma a cada 27 dias).</w:t>
@@ -7876,7 +8523,7 @@
           <w:bCs/>
           <w:b/>
         </w:rPr>
-        <w:t xml:space="preserve">p. 21</w:t>
+        <w:t xml:space="preserve">p. 23</w:t>
       </w:r>
       <w:r>
         <w:t xml:space="preserve">Banco Central via Gazeta do Povo e Revista Oeste (R$ 11 tri; 82,9% do PIB); Revista Oeste (déficit acima de R$ 1 tri pelo 3º ano); Gazeta do Povo (governo admite dívida de 90% do PIB).</w:t>
@@ -7895,7 +8542,7 @@
           <w:bCs/>
           <w:b/>
         </w:rPr>
-        <w:t xml:space="preserve">p. 22</w:t>
+        <w:t xml:space="preserve">p. 24</w:t>
       </w:r>
       <w:r>
         <w:t xml:space="preserve">Poder360 (“Brasil crescerá 2,4% em 2026 e dívida se aproxima de 100% do PIB”); Poder360 (IFI: ajuste fiscal inevitável); IBGE via Revista Oeste (IPCA de 4,58% em 12 meses até set/2026).</w:t>
@@ -7914,7 +8561,7 @@
           <w:bCs/>
           <w:b/>
         </w:rPr>
-        <w:t xml:space="preserve">p. 23</w:t>
+        <w:t xml:space="preserve">p. 25</w:t>
       </w:r>
       <w:r>
         <w:t xml:space="preserve">Migalhas e Congresso em Foco (decisão de Fachin, 08/03/2021, e envio à Justiça Federal do DF); Estado de Minas, checagem de 10/03/2021 (anulação não é absolvição); STF, plenário de 15/04/2021 (8 x 3).</w:t>
@@ -7933,7 +8580,7 @@
           <w:bCs/>
           <w:b/>
         </w:rPr>
-        <w:t xml:space="preserve">p. 24</w:t>
+        <w:t xml:space="preserve">p. 26</w:t>
       </w:r>
       <w:r>
         <w:t xml:space="preserve">Banco Central da Venezuela via Poder360/DW, 29/05/2019 (inflação de 130.060% em 2018); R4V via Bloomberg Línea (6,70 mi na América Latina + 1,19 mi no resto do mundo).</w:t>
@@ -7952,32 +8599,13 @@
           <w:bCs/>
           <w:b/>
         </w:rPr>
-        <w:t xml:space="preserve">p. 25</w:t>
+        <w:t xml:space="preserve">p. 27</w:t>
       </w:r>
       <w:r>
         <w:t xml:space="preserve">INDEC Argentina (IPC 2023, 2024 e 2025).</w:t>
       </w:r>
     </w:p>
-    <w:p>
-      <w:pPr>
-        <w:numPr>
-          <w:ilvl w:val="0"/>
-          <w:numId w:val="1020"/>
-        </w:numPr>
-        <w:pStyle w:val="Compact"/>
-      </w:pPr>
-      <w:r>
-        <w:rPr>
-          <w:bCs/>
-          <w:b/>
-        </w:rPr>
-        <w:t xml:space="preserve">p. 26</w:t>
-      </w:r>
-      <w:r>
-        <w:t xml:space="preserve">Tribunal Supremo Electoral da Bolívia via Agência Brasil e Poder360 (19/10/2025); MercoPress (posse em 08/11/2025); The Rio Times (Bs 6,96); BCB via usdtbol.com, 28/10/2026 (Bs 12,02).</w:t>
-      </w:r>
-    </w:p>
-    <w:bookmarkEnd w:id="95"/>
+    <w:bookmarkEnd w:id="98"/>
     <w:p>
       <w:r>
         <w:pict>
@@ -7998,7 +8626,64 @@
           <w:bCs/>
           <w:b/>
         </w:rPr>
-        <w:t xml:space="preserve">p. 46</w:t>
+        <w:t xml:space="preserve">p. 28</w:t>
+      </w:r>
+      <w:r>
+        <w:t xml:space="preserve">Tribunal Supremo Electoral da Bolívia via Agência Brasil e Poder360 (19/10/2025); MercoPress (posse em 08/11/2025); The Rio Times (Bs 6,96); BCB via usdtbol.com, 28/10/2026 (Bs 12,02).</w:t>
+      </w:r>
+    </w:p>
+    <w:p>
+      <w:pPr>
+        <w:numPr>
+          <w:ilvl w:val="0"/>
+          <w:numId w:val="1021"/>
+        </w:numPr>
+        <w:pStyle w:val="Compact"/>
+      </w:pPr>
+      <w:r>
+        <w:rPr>
+          <w:bCs/>
+          <w:b/>
+        </w:rPr>
+        <w:t xml:space="preserve">p. 32</w:t>
+      </w:r>
+      <w:r>
+        <w:t xml:space="preserve">Gazeta do Povo, mar/2026 (43 medidas; uma a cada 27 dias).</w:t>
+      </w:r>
+    </w:p>
+    <w:p>
+      <w:pPr>
+        <w:numPr>
+          <w:ilvl w:val="0"/>
+          <w:numId w:val="1021"/>
+        </w:numPr>
+        <w:pStyle w:val="Compact"/>
+      </w:pPr>
+      <w:r>
+        <w:rPr>
+          <w:bCs/>
+          <w:b/>
+        </w:rPr>
+        <w:t xml:space="preserve">p. 40</w:t>
+      </w:r>
+      <w:r>
+        <w:t xml:space="preserve">Tribunal Supremo Electoral da Bolívia via Agência Brasil e Poder360 (19/10/2025).</w:t>
+      </w:r>
+    </w:p>
+    <w:p>
+      <w:pPr>
+        <w:numPr>
+          <w:ilvl w:val="0"/>
+          <w:numId w:val="1021"/>
+        </w:numPr>
+        <w:pStyle w:val="Compact"/>
+      </w:pPr>
+      <w:r>
+        <w:rPr>
+          <w:bCs/>
+          <w:b/>
+        </w:rPr>
+        <w:t xml:space="preserve">p. 54</w:t>
       </w:r>
       <w:r>
         <w:t xml:space="preserve">Gazeta do Povo (arrecadação 2025; 1 imposto a cada 27 dias; dívida e juros, ago/2026; herança de 90% do PIB); Poder360 (IOF 3,5%; dívida 82,9% do PIB segundo o BC).</w:t>

</xml_diff>

<commit_message>
Revisão visual completa: capa sem sobreposição, manchetes EXTRA, mapa, faixas e detector de texto sobreposto
Co-Authored-By: Claude Opus 5.5 <noreply@anthropic.com>
Claude-Session: https://claude.ai/code/session_01GJhkYfDrHd3AkmDKDTo71F
</commit_message>
<xml_diff>
--- a/curso/dist/Guia-Como-Convencer-um-Petista.docx
+++ b/curso/dist/Guia-Como-Convencer-um-Petista.docx
@@ -75,7 +75,13 @@
         <w:t xml:space="preserve">BRINDE</w:t>
       </w:r>
       <w:r>
-        <w:t xml:space="preserve">12 xeque-mates + dossiê com 19 QR codes</w:t>
+        <w:t xml:space="preserve">12 xeque-mates</w:t>
+      </w:r>
+      <w:r>
+        <w:br/>
+      </w:r>
+      <w:r>
+        <w:t xml:space="preserve">+ dossiê com QR code</w:t>
       </w:r>
     </w:p>
     <w:p>

</xml_diff>

<commit_message>
Remove grupo VIP e links pendentes; pacote de cadastro na Hotmart
Co-Authored-By: Claude Opus 5.5 <noreply@anthropic.com>
Claude-Session: https://claude.ai/code/session_01GJhkYfDrHd3AkmDKDTo71F
</commit_message>
<xml_diff>
--- a/curso/dist/Guia-Como-Convencer-um-Petista.docx
+++ b/curso/dist/Guia-Como-Convencer-um-Petista.docx
@@ -8212,14 +8212,6 @@
         <w:t xml:space="preserve">Conheça o método para levar seu dinheiro, dentro da lei, para um país com governo de direita.</w:t>
       </w:r>
     </w:p>
-    <w:p>
-      <w:pPr>
-        <w:pStyle w:val="BodyText"/>
-      </w:pPr>
-      <w:r>
-        <w:t xml:space="preserve">[LINK DO CURSO]</w:t>
-      </w:r>
-    </w:p>
     <w:bookmarkEnd w:id="96"/>
     <w:p>
       <w:r>
@@ -8332,14 +8324,6 @@
           <w:b/>
         </w:rPr>
         <w:t xml:space="preserve">Eles não mudaram a direção. Mude você.</w:t>
-      </w:r>
-    </w:p>
-    <w:p>
-      <w:pPr>
-        <w:pStyle w:val="BodyText"/>
-      </w:pPr>
-      <w:r>
-        <w:t xml:space="preserve">[LINK DO CURSO]</w:t>
       </w:r>
     </w:p>
     <w:p>

</xml_diff>